<commit_message>
feat(v1.1.0): fix compulsory revocation template and page filling
- output revocation/change authorization for every execution case

- add automatic 01 line-spacing selection and whitespace validation

- add 03, 10 and 11 specialized output checks
</commit_message>
<xml_diff>
--- a/assets/templates/03撤销暨变更授权委托书_空白模板.docx
+++ b/assets/templates/03撤销暨变更授权委托书_空白模板.docx
@@ -218,7 +218,7 @@
           <w:sz w:val="28"/>
           <w:szCs w:val="28"/>
         </w:rPr>
-        <w:t xml:space="preserve">申请恢复强制执行一案中，现撤销对原受托人的授权委托，变更以下受委托人为我方诉讼代理人。</w:t>
+        <w:t>申请强制执行一案中，现撤销对原受托人的授权委托，变更以下受委托人为我方诉讼代理人。</w:t>
       </w:r>
     </w:p>
     <w:p>
@@ -579,59 +579,9 @@
           <w:rFonts w:hint="eastAsia" w:ascii="仿宋" w:hAnsi="仿宋" w:eastAsia="仿宋"/>
           <w:sz w:val="28"/>
           <w:szCs w:val="28"/>
-        </w:rPr>
-        <w:t>特别授权。代为</w:t>
-      </w:r>
-      <w:r>
-        <w:rPr>
-          <w:rFonts w:hint="eastAsia" w:ascii="仿宋" w:hAnsi="仿宋" w:eastAsia="仿宋"/>
-          <w:sz w:val="28"/>
-          <w:szCs w:val="28"/>
-          <w:lang w:val="en-US" w:eastAsia="zh-CN"/>
-        </w:rPr>
-        <w:t>恢复</w:t>
-      </w:r>
-      <w:r>
-        <w:rPr>
-          <w:rFonts w:hint="eastAsia" w:ascii="仿宋" w:hAnsi="仿宋" w:eastAsia="仿宋"/>
-          <w:sz w:val="28"/>
-          <w:szCs w:val="28"/>
-        </w:rPr>
-        <w:t>申请</w:t>
-      </w:r>
-      <w:r>
-        <w:rPr>
-          <w:rFonts w:hint="eastAsia" w:ascii="仿宋" w:hAnsi="仿宋" w:eastAsia="仿宋"/>
-          <w:sz w:val="28"/>
-          <w:szCs w:val="28"/>
-          <w:lang w:val="en-US" w:eastAsia="zh-CN"/>
-        </w:rPr>
-        <w:t>强制</w:t>
-      </w:r>
-      <w:r>
-        <w:rPr>
-          <w:rFonts w:hint="eastAsia" w:ascii="仿宋" w:hAnsi="仿宋" w:eastAsia="仿宋"/>
-          <w:sz w:val="28"/>
-          <w:szCs w:val="28"/>
-        </w:rPr>
-        <w:t>执行，代为提起</w:t>
-      </w:r>
-      <w:r>
-        <w:rPr>
-          <w:rFonts w:hint="eastAsia" w:ascii="仿宋" w:hAnsi="仿宋" w:eastAsia="仿宋"/>
-          <w:sz w:val="28"/>
-          <w:szCs w:val="28"/>
-          <w:lang w:val="en-US" w:eastAsia="zh-CN"/>
-        </w:rPr>
-        <w:t>恢复</w:t>
-      </w:r>
-      <w:r>
-        <w:rPr>
-          <w:rFonts w:hint="eastAsia" w:ascii="仿宋" w:hAnsi="仿宋" w:eastAsia="仿宋"/>
-          <w:sz w:val="28"/>
-          <w:szCs w:val="28"/>
-        </w:rPr>
-        <w:t>执行申请、承认、放弃、变更执行请求，进行和解、调解，签收法律文书等。</w:t>
+          <w:color w:val="000000"/>
+        </w:rPr>
+        <w:t xml:space="preserve">特别授权。代为申请执行，代为提起执行申请、承认、放弃、变更执行请求，进行和解、调解，签收法律文书等。</w:t>
       </w:r>
     </w:p>
     <w:p>

</xml_diff>